<commit_message>
Adding some more intermediate level query
</commit_message>
<xml_diff>
--- a/aggrigation queries.docx
+++ b/aggrigation queries.docx
@@ -37,16 +37,13 @@
         <w:br/>
         <w:t xml:space="preserve">Ans. </w:t>
       </w:r>
-      <w:r>
-        <w:t>db["users"</w:t>
-      </w:r>
-      <w:proofErr w:type="gramStart"/>
-      <w:r>
-        <w:t>].find</w:t>
-      </w:r>
-      <w:proofErr w:type="gramEnd"/>
-      <w:r>
-        <w:t>()</w:t>
+      <w:proofErr w:type="spellStart"/>
+      <w:r>
+        <w:t>db</w:t>
+      </w:r>
+      <w:proofErr w:type="spellEnd"/>
+      <w:r>
+        <w:t>["users"].find()</w:t>
       </w:r>
     </w:p>
     <w:p>
@@ -70,16 +67,13 @@
         <w:br/>
         <w:t xml:space="preserve">Ans. </w:t>
       </w:r>
-      <w:r>
-        <w:t>db["products"</w:t>
-      </w:r>
-      <w:proofErr w:type="gramStart"/>
-      <w:r>
-        <w:t>].find</w:t>
-      </w:r>
-      <w:proofErr w:type="gramEnd"/>
-      <w:r>
-        <w:t>()</w:t>
+      <w:proofErr w:type="spellStart"/>
+      <w:r>
+        <w:t>db</w:t>
+      </w:r>
+      <w:proofErr w:type="spellEnd"/>
+      <w:r>
+        <w:t>["products"].find()</w:t>
       </w:r>
     </w:p>
     <w:p>
@@ -104,76 +98,274 @@
         <w:rPr>
           <w:rStyle w:val="linearstyleChar"/>
         </w:rPr>
-        <w:t xml:space="preserve">. [ </w:t>
-      </w:r>
-      <w:proofErr w:type="gramStart"/>
-      <w:r>
-        <w:rPr>
-          <w:rStyle w:val="linearstyleChar"/>
-        </w:rPr>
-        <w:t>{ $</w:t>
-      </w:r>
-      <w:proofErr w:type="gramEnd"/>
-      <w:r>
-        <w:rPr>
-          <w:rStyle w:val="linearstyleChar"/>
-        </w:rPr>
-        <w:t xml:space="preserve">match: </w:t>
-      </w:r>
-      <w:proofErr w:type="gramStart"/>
-      <w:r>
-        <w:rPr>
-          <w:rStyle w:val="linearstyleChar"/>
-        </w:rPr>
-        <w:t>{ city</w:t>
-      </w:r>
-      <w:proofErr w:type="gramEnd"/>
-      <w:r>
-        <w:rPr>
-          <w:rStyle w:val="linearstyleChar"/>
-        </w:rPr>
-        <w:t>: "Surat</w:t>
-      </w:r>
-      <w:proofErr w:type="gramStart"/>
-      <w:r>
-        <w:rPr>
-          <w:rStyle w:val="linearstyleChar"/>
-        </w:rPr>
+        <w:t>. [ { $match: { city: "Surat" } } ]</w:t>
+      </w:r>
+    </w:p>
+    <w:p>
+      <w:pPr>
+        <w:pStyle w:val="NoSpacing"/>
+      </w:pPr>
+      <w:r>
+        <w:rPr>
+          <w:b/>
+          <w:bCs/>
+        </w:rPr>
+        <w:t>04</w:t>
+      </w:r>
+      <w:r>
+        <w:t>. Find products with price greater than 5000.</w:t>
+      </w:r>
+      <w:r>
+        <w:br/>
+        <w:t>Ans: [</w:t>
+      </w:r>
+    </w:p>
+    <w:p>
+      <w:pPr>
+        <w:pStyle w:val="NoSpacing"/>
+      </w:pPr>
+      <w:r>
+        <w:t xml:space="preserve">  {</w:t>
+      </w:r>
+    </w:p>
+    <w:p>
+      <w:pPr>
+        <w:pStyle w:val="NoSpacing"/>
+      </w:pPr>
+      <w:r>
+        <w:t xml:space="preserve">    $match: {</w:t>
+      </w:r>
+    </w:p>
+    <w:p>
+      <w:pPr>
+        <w:pStyle w:val="NoSpacing"/>
+      </w:pPr>
+      <w:r>
+        <w:t xml:space="preserve">      price: {$</w:t>
+      </w:r>
+      <w:proofErr w:type="spellStart"/>
+      <w:r>
+        <w:t>gt</w:t>
+      </w:r>
+      <w:proofErr w:type="spellEnd"/>
+      <w:r>
+        <w:t>: 5000}</w:t>
+      </w:r>
+    </w:p>
+    <w:p>
+      <w:pPr>
+        <w:pStyle w:val="NoSpacing"/>
+      </w:pPr>
+      <w:r>
+        <w:t xml:space="preserve">    }</w:t>
+      </w:r>
+    </w:p>
+    <w:p>
+      <w:pPr>
+        <w:pStyle w:val="NoSpacing"/>
+      </w:pPr>
+      <w:r>
+        <w:t xml:space="preserve">  }</w:t>
+      </w:r>
+    </w:p>
+    <w:p>
+      <w:pPr>
+        <w:pStyle w:val="NoSpacing"/>
+      </w:pPr>
+      <w:r>
+        <w:t>]</w:t>
+      </w:r>
+    </w:p>
+    <w:p>
+      <w:pPr>
+        <w:pStyle w:val="NoSpacing"/>
+      </w:pPr>
+      <w:r>
+        <w:br/>
+      </w:r>
+      <w:r>
+        <w:rPr>
+          <w:b/>
+          <w:bCs/>
+        </w:rPr>
+        <w:t>05</w:t>
+      </w:r>
+      <w:r>
+        <w:t>. Find orders with status = completed.</w:t>
+      </w:r>
+    </w:p>
+    <w:p>
+      <w:pPr>
+        <w:pStyle w:val="NoSpacing"/>
+      </w:pPr>
+      <w:r>
+        <w:t xml:space="preserve">Ans: </w:t>
+      </w:r>
+      <w:r>
+        <w:t xml:space="preserve"> </w:t>
+      </w:r>
+      <w:r>
+        <w:t>[</w:t>
+      </w:r>
+    </w:p>
+    <w:p>
+      <w:pPr>
+        <w:pStyle w:val="NoSpacing"/>
+      </w:pPr>
+      <w:r>
+        <w:t xml:space="preserve">  {</w:t>
+      </w:r>
+    </w:p>
+    <w:p>
+      <w:pPr>
+        <w:pStyle w:val="NoSpacing"/>
+      </w:pPr>
+      <w:r>
+        <w:t xml:space="preserve">    $match: {</w:t>
+      </w:r>
+    </w:p>
+    <w:p>
+      <w:pPr>
+        <w:pStyle w:val="NoSpacing"/>
+      </w:pPr>
+      <w:r>
+        <w:t xml:space="preserve">      status: "Delivered"</w:t>
+      </w:r>
+    </w:p>
+    <w:p>
+      <w:pPr>
+        <w:pStyle w:val="NoSpacing"/>
+      </w:pPr>
+      <w:r>
+        <w:t xml:space="preserve">    }</w:t>
+      </w:r>
+    </w:p>
+    <w:p>
+      <w:pPr>
+        <w:pStyle w:val="NoSpacing"/>
+      </w:pPr>
+      <w:r>
+        <w:t xml:space="preserve">  },</w:t>
+      </w:r>
+    </w:p>
+    <w:p>
+      <w:pPr>
+        <w:pStyle w:val="NoSpacing"/>
+      </w:pPr>
+      <w:r>
+        <w:t xml:space="preserve">  {</w:t>
+      </w:r>
+    </w:p>
+    <w:p>
+      <w:pPr>
+        <w:pStyle w:val="NoSpacing"/>
+      </w:pPr>
+      <w:r>
+        <w:t xml:space="preserve">    $lookup: {</w:t>
+      </w:r>
+    </w:p>
+    <w:p>
+      <w:pPr>
+        <w:pStyle w:val="NoSpacing"/>
+      </w:pPr>
+      <w:r>
+        <w:t xml:space="preserve">      from: "users",</w:t>
+      </w:r>
+    </w:p>
+    <w:p>
+      <w:pPr>
+        <w:pStyle w:val="NoSpacing"/>
+      </w:pPr>
+      <w:r>
+        <w:t xml:space="preserve">      </w:t>
+      </w:r>
+      <w:proofErr w:type="spellStart"/>
+      <w:r>
+        <w:t>localField</w:t>
+      </w:r>
+      <w:proofErr w:type="spellEnd"/>
+      <w:r>
+        <w:t>: "</w:t>
+      </w:r>
+      <w:proofErr w:type="spellStart"/>
+      <w:r>
+        <w:t>userId</w:t>
+      </w:r>
+      <w:proofErr w:type="spellEnd"/>
+      <w:r>
+        <w:t>",</w:t>
+      </w:r>
+    </w:p>
+    <w:p>
+      <w:pPr>
+        <w:pStyle w:val="NoSpacing"/>
+      </w:pPr>
+      <w:r>
+        <w:t xml:space="preserve">      </w:t>
+      </w:r>
+      <w:proofErr w:type="spellStart"/>
+      <w:r>
+        <w:t>foreignField</w:t>
+      </w:r>
+      <w:proofErr w:type="spellEnd"/>
+      <w:r>
+        <w:t>: "_id",</w:t>
+      </w:r>
+    </w:p>
+    <w:p>
+      <w:pPr>
+        <w:pStyle w:val="NoSpacing"/>
+      </w:pPr>
+      <w:r>
+        <w:t xml:space="preserve">      as: "</w:t>
+      </w:r>
+      <w:proofErr w:type="spellStart"/>
+      <w:r>
+        <w:t>user_details</w:t>
+      </w:r>
+      <w:proofErr w:type="spellEnd"/>
+      <w:r>
+        <w:t>"</w:t>
+      </w:r>
+    </w:p>
+    <w:p>
+      <w:pPr>
+        <w:pStyle w:val="NoSpacing"/>
+      </w:pPr>
+      <w:r>
+        <w:t xml:space="preserve">    }</w:t>
+      </w:r>
+    </w:p>
+    <w:p>
+      <w:pPr>
+        <w:pStyle w:val="NoSpacing"/>
+      </w:pPr>
+      <w:r>
+        <w:t xml:space="preserve">  },</w:t>
+      </w:r>
+    </w:p>
+    <w:p>
+      <w:pPr>
+        <w:pStyle w:val="NoSpacing"/>
+      </w:pPr>
+      <w:r>
+        <w:t xml:space="preserve">    { $unwind: "$</w:t>
+      </w:r>
+      <w:proofErr w:type="spellStart"/>
+      <w:r>
+        <w:t>user_details</w:t>
+      </w:r>
+      <w:proofErr w:type="spellEnd"/>
+      <w:r>
         <w:t>" }</w:t>
       </w:r>
-      <w:proofErr w:type="gramEnd"/>
-      <w:r>
-        <w:rPr>
-          <w:rStyle w:val="linearstyleChar"/>
-        </w:rPr>
-        <w:t xml:space="preserve"> </w:t>
-      </w:r>
-      <w:proofErr w:type="gramStart"/>
-      <w:r>
-        <w:rPr>
-          <w:rStyle w:val="linearstyleChar"/>
-        </w:rPr>
-        <w:t>} ]</w:t>
-      </w:r>
-      <w:proofErr w:type="gramEnd"/>
-    </w:p>
-    <w:p>
-      <w:pPr>
-        <w:pStyle w:val="NoSpacing"/>
-      </w:pPr>
-      <w:r>
-        <w:rPr>
-          <w:b/>
-          <w:bCs/>
-        </w:rPr>
-        <w:t>04</w:t>
-      </w:r>
-      <w:r>
-        <w:t>. Find products with price greater than 5000.</w:t>
-      </w:r>
-      <w:r>
-        <w:br/>
-        <w:t>Ans: [</w:t>
+    </w:p>
+    <w:p>
+      <w:pPr>
+        <w:pStyle w:val="NoSpacing"/>
+      </w:pPr>
+      <w:r>
+        <w:t xml:space="preserve">  ,</w:t>
       </w:r>
     </w:p>
     <w:p>
@@ -189,77 +381,104 @@
         <w:pStyle w:val="NoSpacing"/>
       </w:pPr>
       <w:r>
-        <w:t xml:space="preserve">    $match: {</w:t>
-      </w:r>
-    </w:p>
-    <w:p>
-      <w:pPr>
-        <w:pStyle w:val="NoSpacing"/>
-      </w:pPr>
-      <w:r>
-        <w:t xml:space="preserve">      price: {$gt: 5000}</w:t>
-      </w:r>
-    </w:p>
-    <w:p>
-      <w:pPr>
-        <w:pStyle w:val="NoSpacing"/>
-      </w:pPr>
-      <w:r>
-        <w:t xml:space="preserve">    }</w:t>
-      </w:r>
-    </w:p>
-    <w:p>
-      <w:pPr>
-        <w:pStyle w:val="NoSpacing"/>
-      </w:pPr>
-      <w:r>
-        <w:t xml:space="preserve">  }</w:t>
-      </w:r>
-    </w:p>
-    <w:p>
-      <w:pPr>
-        <w:pStyle w:val="NoSpacing"/>
-      </w:pPr>
-      <w:r>
-        <w:t>]</w:t>
-      </w:r>
-    </w:p>
-    <w:p>
-      <w:pPr>
-        <w:pStyle w:val="NoSpacing"/>
-      </w:pPr>
-      <w:r>
-        <w:br/>
-      </w:r>
-      <w:r>
-        <w:rPr>
-          <w:b/>
-          <w:bCs/>
-        </w:rPr>
-        <w:t>05</w:t>
-      </w:r>
-      <w:r>
-        <w:t>. Find orders with status = completed.</w:t>
-      </w:r>
-    </w:p>
-    <w:p>
-      <w:pPr>
-        <w:pStyle w:val="NoSpacing"/>
-      </w:pPr>
-      <w:r>
-        <w:t>Ans</w:t>
-      </w:r>
-      <w:proofErr w:type="gramStart"/>
-      <w:r>
-        <w:t xml:space="preserve">: </w:t>
-      </w:r>
-      <w:r>
-        <w:t xml:space="preserve"> </w:t>
-      </w:r>
-      <w:r>
-        <w:t>[</w:t>
-      </w:r>
-      <w:proofErr w:type="gramEnd"/>
+        <w:t xml:space="preserve">    $lookup: {</w:t>
+      </w:r>
+    </w:p>
+    <w:p>
+      <w:pPr>
+        <w:pStyle w:val="NoSpacing"/>
+      </w:pPr>
+      <w:r>
+        <w:t xml:space="preserve">      from: "products",</w:t>
+      </w:r>
+    </w:p>
+    <w:p>
+      <w:pPr>
+        <w:pStyle w:val="NoSpacing"/>
+      </w:pPr>
+      <w:r>
+        <w:t xml:space="preserve">      </w:t>
+      </w:r>
+      <w:proofErr w:type="spellStart"/>
+      <w:r>
+        <w:t>localField</w:t>
+      </w:r>
+      <w:proofErr w:type="spellEnd"/>
+      <w:r>
+        <w:t>: "</w:t>
+      </w:r>
+      <w:proofErr w:type="spellStart"/>
+      <w:r>
+        <w:t>productId</w:t>
+      </w:r>
+      <w:proofErr w:type="spellEnd"/>
+      <w:r>
+        <w:t>",</w:t>
+      </w:r>
+    </w:p>
+    <w:p>
+      <w:pPr>
+        <w:pStyle w:val="NoSpacing"/>
+      </w:pPr>
+      <w:r>
+        <w:t xml:space="preserve">      </w:t>
+      </w:r>
+      <w:proofErr w:type="spellStart"/>
+      <w:r>
+        <w:t>foreignField</w:t>
+      </w:r>
+      <w:proofErr w:type="spellEnd"/>
+      <w:r>
+        <w:t>: "_id",</w:t>
+      </w:r>
+    </w:p>
+    <w:p>
+      <w:pPr>
+        <w:pStyle w:val="NoSpacing"/>
+      </w:pPr>
+      <w:r>
+        <w:t xml:space="preserve">      as: "</w:t>
+      </w:r>
+      <w:proofErr w:type="spellStart"/>
+      <w:r>
+        <w:t>product_details</w:t>
+      </w:r>
+      <w:proofErr w:type="spellEnd"/>
+      <w:r>
+        <w:t>"</w:t>
+      </w:r>
+    </w:p>
+    <w:p>
+      <w:pPr>
+        <w:pStyle w:val="NoSpacing"/>
+      </w:pPr>
+      <w:r>
+        <w:t xml:space="preserve">    },</w:t>
+      </w:r>
+    </w:p>
+    <w:p>
+      <w:pPr>
+        <w:pStyle w:val="NoSpacing"/>
+      </w:pPr>
+      <w:r>
+        <w:t xml:space="preserve">  },</w:t>
+      </w:r>
+    </w:p>
+    <w:p>
+      <w:pPr>
+        <w:pStyle w:val="NoSpacing"/>
+      </w:pPr>
+      <w:r>
+        <w:t xml:space="preserve">  { $unwind: "$</w:t>
+      </w:r>
+      <w:proofErr w:type="spellStart"/>
+      <w:r>
+        <w:t>product_details</w:t>
+      </w:r>
+      <w:proofErr w:type="spellEnd"/>
+      <w:r>
+        <w:t>" },</w:t>
+      </w:r>
     </w:p>
     <w:p>
       <w:pPr>
@@ -274,227 +493,6 @@
         <w:pStyle w:val="NoSpacing"/>
       </w:pPr>
       <w:r>
-        <w:t xml:space="preserve">    $match: {</w:t>
-      </w:r>
-    </w:p>
-    <w:p>
-      <w:pPr>
-        <w:pStyle w:val="NoSpacing"/>
-      </w:pPr>
-      <w:r>
-        <w:t xml:space="preserve">      status: "Delivered"</w:t>
-      </w:r>
-    </w:p>
-    <w:p>
-      <w:pPr>
-        <w:pStyle w:val="NoSpacing"/>
-      </w:pPr>
-      <w:r>
-        <w:t xml:space="preserve">    }</w:t>
-      </w:r>
-    </w:p>
-    <w:p>
-      <w:pPr>
-        <w:pStyle w:val="NoSpacing"/>
-      </w:pPr>
-      <w:r>
-        <w:t xml:space="preserve">  },</w:t>
-      </w:r>
-    </w:p>
-    <w:p>
-      <w:pPr>
-        <w:pStyle w:val="NoSpacing"/>
-      </w:pPr>
-      <w:r>
-        <w:t xml:space="preserve">  {</w:t>
-      </w:r>
-    </w:p>
-    <w:p>
-      <w:pPr>
-        <w:pStyle w:val="NoSpacing"/>
-      </w:pPr>
-      <w:r>
-        <w:t xml:space="preserve">    $lookup: {</w:t>
-      </w:r>
-    </w:p>
-    <w:p>
-      <w:pPr>
-        <w:pStyle w:val="NoSpacing"/>
-      </w:pPr>
-      <w:r>
-        <w:t xml:space="preserve">      from: "users",</w:t>
-      </w:r>
-    </w:p>
-    <w:p>
-      <w:pPr>
-        <w:pStyle w:val="NoSpacing"/>
-      </w:pPr>
-      <w:r>
-        <w:t xml:space="preserve">      localField: "userId",</w:t>
-      </w:r>
-    </w:p>
-    <w:p>
-      <w:pPr>
-        <w:pStyle w:val="NoSpacing"/>
-      </w:pPr>
-      <w:r>
-        <w:t xml:space="preserve">      foreignField: "_id",</w:t>
-      </w:r>
-    </w:p>
-    <w:p>
-      <w:pPr>
-        <w:pStyle w:val="NoSpacing"/>
-      </w:pPr>
-      <w:r>
-        <w:t xml:space="preserve">      as: "user_details"</w:t>
-      </w:r>
-    </w:p>
-    <w:p>
-      <w:pPr>
-        <w:pStyle w:val="NoSpacing"/>
-      </w:pPr>
-      <w:r>
-        <w:t xml:space="preserve">    }</w:t>
-      </w:r>
-    </w:p>
-    <w:p>
-      <w:pPr>
-        <w:pStyle w:val="NoSpacing"/>
-      </w:pPr>
-      <w:r>
-        <w:t xml:space="preserve">  },</w:t>
-      </w:r>
-    </w:p>
-    <w:p>
-      <w:pPr>
-        <w:pStyle w:val="NoSpacing"/>
-      </w:pPr>
-      <w:r>
-        <w:t xml:space="preserve">    </w:t>
-      </w:r>
-      <w:proofErr w:type="gramStart"/>
-      <w:r>
-        <w:t>{ $</w:t>
-      </w:r>
-      <w:proofErr w:type="gramEnd"/>
-      <w:r>
-        <w:t>unwind: "$user_details</w:t>
-      </w:r>
-      <w:proofErr w:type="gramStart"/>
-      <w:r>
-        <w:t>" }</w:t>
-      </w:r>
-      <w:proofErr w:type="gramEnd"/>
-    </w:p>
-    <w:p>
-      <w:pPr>
-        <w:pStyle w:val="NoSpacing"/>
-      </w:pPr>
-      <w:r>
-        <w:t xml:space="preserve">  ,</w:t>
-      </w:r>
-    </w:p>
-    <w:p>
-      <w:pPr>
-        <w:pStyle w:val="NoSpacing"/>
-      </w:pPr>
-      <w:r>
-        <w:t xml:space="preserve">  {</w:t>
-      </w:r>
-    </w:p>
-    <w:p>
-      <w:pPr>
-        <w:pStyle w:val="NoSpacing"/>
-      </w:pPr>
-      <w:r>
-        <w:t xml:space="preserve">    $lookup: {</w:t>
-      </w:r>
-    </w:p>
-    <w:p>
-      <w:pPr>
-        <w:pStyle w:val="NoSpacing"/>
-      </w:pPr>
-      <w:r>
-        <w:t xml:space="preserve">      from: "products",</w:t>
-      </w:r>
-    </w:p>
-    <w:p>
-      <w:pPr>
-        <w:pStyle w:val="NoSpacing"/>
-      </w:pPr>
-      <w:r>
-        <w:t xml:space="preserve">      localField: "productId",</w:t>
-      </w:r>
-    </w:p>
-    <w:p>
-      <w:pPr>
-        <w:pStyle w:val="NoSpacing"/>
-      </w:pPr>
-      <w:r>
-        <w:t xml:space="preserve">      foreignField: "_id",</w:t>
-      </w:r>
-    </w:p>
-    <w:p>
-      <w:pPr>
-        <w:pStyle w:val="NoSpacing"/>
-      </w:pPr>
-      <w:r>
-        <w:t xml:space="preserve">      as: "product_details"</w:t>
-      </w:r>
-    </w:p>
-    <w:p>
-      <w:pPr>
-        <w:pStyle w:val="NoSpacing"/>
-      </w:pPr>
-      <w:r>
-        <w:t xml:space="preserve">    },</w:t>
-      </w:r>
-    </w:p>
-    <w:p>
-      <w:pPr>
-        <w:pStyle w:val="NoSpacing"/>
-      </w:pPr>
-      <w:r>
-        <w:t xml:space="preserve">  },</w:t>
-      </w:r>
-    </w:p>
-    <w:p>
-      <w:pPr>
-        <w:pStyle w:val="NoSpacing"/>
-      </w:pPr>
-      <w:r>
-        <w:t xml:space="preserve">  </w:t>
-      </w:r>
-      <w:proofErr w:type="gramStart"/>
-      <w:r>
-        <w:t>{ $</w:t>
-      </w:r>
-      <w:proofErr w:type="gramEnd"/>
-      <w:r>
-        <w:t>unwind: "$product_details</w:t>
-      </w:r>
-      <w:proofErr w:type="gramStart"/>
-      <w:r>
-        <w:t>" }</w:t>
-      </w:r>
-      <w:proofErr w:type="gramEnd"/>
-      <w:r>
-        <w:t>,</w:t>
-      </w:r>
-    </w:p>
-    <w:p>
-      <w:pPr>
-        <w:pStyle w:val="NoSpacing"/>
-      </w:pPr>
-      <w:r>
-        <w:t xml:space="preserve">  {</w:t>
-      </w:r>
-    </w:p>
-    <w:p>
-      <w:pPr>
-        <w:pStyle w:val="NoSpacing"/>
-      </w:pPr>
-      <w:r>
         <w:t xml:space="preserve">     $project: {</w:t>
       </w:r>
     </w:p>
@@ -535,13 +533,13 @@
         <w:pStyle w:val="NoSpacing"/>
       </w:pPr>
       <w:r>
-        <w:t xml:space="preserve">      price: "$product_</w:t>
-      </w:r>
-      <w:proofErr w:type="gramStart"/>
-      <w:r>
-        <w:t>details.price</w:t>
-      </w:r>
-      <w:proofErr w:type="gramEnd"/>
+        <w:t xml:space="preserve">      price: "$</w:t>
+      </w:r>
+      <w:proofErr w:type="spellStart"/>
+      <w:r>
+        <w:t>product_details.price</w:t>
+      </w:r>
+      <w:proofErr w:type="spellEnd"/>
       <w:r>
         <w:t>"</w:t>
       </w:r>
@@ -634,7 +632,15 @@
         <w:pStyle w:val="NoSpacing"/>
       </w:pPr>
       <w:r>
-        <w:t xml:space="preserve">        $gt: 25</w:t>
+        <w:t xml:space="preserve">        $</w:t>
+      </w:r>
+      <w:proofErr w:type="spellStart"/>
+      <w:r>
+        <w:t>gt</w:t>
+      </w:r>
+      <w:proofErr w:type="spellEnd"/>
+      <w:r>
+        <w:t>: 25</w:t>
       </w:r>
     </w:p>
     <w:p>
@@ -716,7 +722,15 @@
         <w:pStyle w:val="NoSpacing"/>
       </w:pPr>
       <w:r>
-        <w:t xml:space="preserve">      stock: {$gt: 0}</w:t>
+        <w:t xml:space="preserve">      stock: {$</w:t>
+      </w:r>
+      <w:proofErr w:type="spellStart"/>
+      <w:r>
+        <w:t>gt</w:t>
+      </w:r>
+      <w:proofErr w:type="spellEnd"/>
+      <w:r>
+        <w:t>: 0}</w:t>
       </w:r>
     </w:p>
     <w:p>
@@ -761,13 +775,8 @@
         <w:pStyle w:val="NoSpacing"/>
       </w:pPr>
       <w:r>
-        <w:t>Ans</w:t>
-      </w:r>
-      <w:proofErr w:type="gramStart"/>
-      <w:r>
-        <w:t>:  [</w:t>
-      </w:r>
-      <w:proofErr w:type="gramEnd"/>
+        <w:t>Ans:  [</w:t>
+      </w:r>
     </w:p>
     <w:p>
       <w:pPr>
@@ -790,7 +799,15 @@
         <w:pStyle w:val="NoSpacing"/>
       </w:pPr>
       <w:r>
-        <w:t xml:space="preserve">      total: {$gt: 1000}</w:t>
+        <w:t xml:space="preserve">      total: {$</w:t>
+      </w:r>
+      <w:proofErr w:type="spellStart"/>
+      <w:r>
+        <w:t>gt</w:t>
+      </w:r>
+      <w:proofErr w:type="spellEnd"/>
+      <w:r>
+        <w:t>: 1000}</w:t>
       </w:r>
     </w:p>
     <w:p>
@@ -838,23 +855,55 @@
         <w:pStyle w:val="NoSpacing"/>
       </w:pPr>
       <w:r>
-        <w:t xml:space="preserve">      localField: "userId",</w:t>
-      </w:r>
-    </w:p>
-    <w:p>
-      <w:pPr>
-        <w:pStyle w:val="NoSpacing"/>
-      </w:pPr>
-      <w:r>
-        <w:t xml:space="preserve">      foreignField: "_id",</w:t>
-      </w:r>
-    </w:p>
-    <w:p>
-      <w:pPr>
-        <w:pStyle w:val="NoSpacing"/>
-      </w:pPr>
-      <w:r>
-        <w:t xml:space="preserve">      as: "user_details"</w:t>
+        <w:t xml:space="preserve">      </w:t>
+      </w:r>
+      <w:proofErr w:type="spellStart"/>
+      <w:r>
+        <w:t>localField</w:t>
+      </w:r>
+      <w:proofErr w:type="spellEnd"/>
+      <w:r>
+        <w:t>: "</w:t>
+      </w:r>
+      <w:proofErr w:type="spellStart"/>
+      <w:r>
+        <w:t>userId</w:t>
+      </w:r>
+      <w:proofErr w:type="spellEnd"/>
+      <w:r>
+        <w:t>",</w:t>
+      </w:r>
+    </w:p>
+    <w:p>
+      <w:pPr>
+        <w:pStyle w:val="NoSpacing"/>
+      </w:pPr>
+      <w:r>
+        <w:t xml:space="preserve">      </w:t>
+      </w:r>
+      <w:proofErr w:type="spellStart"/>
+      <w:r>
+        <w:t>foreignField</w:t>
+      </w:r>
+      <w:proofErr w:type="spellEnd"/>
+      <w:r>
+        <w:t>: "_id",</w:t>
+      </w:r>
+    </w:p>
+    <w:p>
+      <w:pPr>
+        <w:pStyle w:val="NoSpacing"/>
+      </w:pPr>
+      <w:r>
+        <w:t xml:space="preserve">      as: "</w:t>
+      </w:r>
+      <w:proofErr w:type="spellStart"/>
+      <w:r>
+        <w:t>user_details</w:t>
+      </w:r>
+      <w:proofErr w:type="spellEnd"/>
+      <w:r>
+        <w:t>"</w:t>
       </w:r>
     </w:p>
     <w:p>
@@ -878,28 +927,353 @@
         <w:pStyle w:val="NoSpacing"/>
       </w:pPr>
       <w:r>
+        <w:t xml:space="preserve">    { $unwind: "$</w:t>
+      </w:r>
+      <w:proofErr w:type="spellStart"/>
+      <w:r>
+        <w:t>user_details</w:t>
+      </w:r>
+      <w:proofErr w:type="spellEnd"/>
+      <w:r>
+        <w:t>" }</w:t>
+      </w:r>
+    </w:p>
+    <w:p>
+      <w:pPr>
+        <w:pStyle w:val="NoSpacing"/>
+      </w:pPr>
+      <w:r>
+        <w:t xml:space="preserve">  ,</w:t>
+      </w:r>
+    </w:p>
+    <w:p>
+      <w:pPr>
+        <w:pStyle w:val="NoSpacing"/>
+      </w:pPr>
+      <w:r>
+        <w:t xml:space="preserve">  {</w:t>
+      </w:r>
+    </w:p>
+    <w:p>
+      <w:pPr>
+        <w:pStyle w:val="NoSpacing"/>
+      </w:pPr>
+      <w:r>
+        <w:t xml:space="preserve">    $lookup: {</w:t>
+      </w:r>
+    </w:p>
+    <w:p>
+      <w:pPr>
+        <w:pStyle w:val="NoSpacing"/>
+      </w:pPr>
+      <w:r>
+        <w:t xml:space="preserve">      from: "products",</w:t>
+      </w:r>
+    </w:p>
+    <w:p>
+      <w:pPr>
+        <w:pStyle w:val="NoSpacing"/>
+      </w:pPr>
+      <w:r>
+        <w:t xml:space="preserve">      </w:t>
+      </w:r>
+      <w:proofErr w:type="spellStart"/>
+      <w:r>
+        <w:t>localField</w:t>
+      </w:r>
+      <w:proofErr w:type="spellEnd"/>
+      <w:r>
+        <w:t>: "</w:t>
+      </w:r>
+      <w:proofErr w:type="spellStart"/>
+      <w:r>
+        <w:t>productId</w:t>
+      </w:r>
+      <w:proofErr w:type="spellEnd"/>
+      <w:r>
+        <w:t>",</w:t>
+      </w:r>
+    </w:p>
+    <w:p>
+      <w:pPr>
+        <w:pStyle w:val="NoSpacing"/>
+      </w:pPr>
+      <w:r>
+        <w:t xml:space="preserve">      </w:t>
+      </w:r>
+      <w:proofErr w:type="spellStart"/>
+      <w:r>
+        <w:t>foreignField</w:t>
+      </w:r>
+      <w:proofErr w:type="spellEnd"/>
+      <w:r>
+        <w:t>: "_id",</w:t>
+      </w:r>
+    </w:p>
+    <w:p>
+      <w:pPr>
+        <w:pStyle w:val="NoSpacing"/>
+      </w:pPr>
+      <w:r>
+        <w:t xml:space="preserve">      as: "</w:t>
+      </w:r>
+      <w:proofErr w:type="spellStart"/>
+      <w:r>
+        <w:t>product_details</w:t>
+      </w:r>
+      <w:proofErr w:type="spellEnd"/>
+      <w:r>
+        <w:t>"</w:t>
+      </w:r>
+    </w:p>
+    <w:p>
+      <w:pPr>
+        <w:pStyle w:val="NoSpacing"/>
+      </w:pPr>
+      <w:r>
+        <w:t xml:space="preserve">    },</w:t>
+      </w:r>
+    </w:p>
+    <w:p>
+      <w:pPr>
+        <w:pStyle w:val="NoSpacing"/>
+      </w:pPr>
+      <w:r>
+        <w:t xml:space="preserve">  },</w:t>
+      </w:r>
+    </w:p>
+    <w:p>
+      <w:pPr>
+        <w:pStyle w:val="NoSpacing"/>
+      </w:pPr>
+      <w:r>
+        <w:t xml:space="preserve">  { $unwind: "$</w:t>
+      </w:r>
+      <w:proofErr w:type="spellStart"/>
+      <w:r>
+        <w:t>product_details</w:t>
+      </w:r>
+      <w:proofErr w:type="spellEnd"/>
+      <w:r>
+        <w:t>" },</w:t>
+      </w:r>
+    </w:p>
+    <w:p>
+      <w:pPr>
+        <w:pStyle w:val="NoSpacing"/>
+      </w:pPr>
+      <w:r>
+        <w:t xml:space="preserve">  {</w:t>
+      </w:r>
+    </w:p>
+    <w:p>
+      <w:pPr>
+        <w:pStyle w:val="NoSpacing"/>
+      </w:pPr>
+      <w:r>
+        <w:t xml:space="preserve">     $project: {</w:t>
+      </w:r>
+    </w:p>
+    <w:p>
+      <w:pPr>
+        <w:pStyle w:val="NoSpacing"/>
+      </w:pPr>
+      <w:r>
+        <w:t xml:space="preserve">      quantity: 1,</w:t>
+      </w:r>
+    </w:p>
+    <w:p>
+      <w:pPr>
+        <w:pStyle w:val="NoSpacing"/>
+      </w:pPr>
+      <w:r>
+        <w:t xml:space="preserve">      total: 1,</w:t>
+      </w:r>
+    </w:p>
+    <w:p>
+      <w:pPr>
+        <w:pStyle w:val="NoSpacing"/>
+      </w:pPr>
+      <w:r>
+        <w:t xml:space="preserve">      user: "$user_details.name",</w:t>
+      </w:r>
+    </w:p>
+    <w:p>
+      <w:pPr>
+        <w:pStyle w:val="NoSpacing"/>
+      </w:pPr>
+      <w:r>
+        <w:t xml:space="preserve">      </w:t>
+      </w:r>
+      <w:proofErr w:type="spellStart"/>
+      <w:r>
+        <w:t>paroduct</w:t>
+      </w:r>
+      <w:proofErr w:type="spellEnd"/>
+      <w:r>
+        <w:t>: "$product_details.name",</w:t>
+      </w:r>
+    </w:p>
+    <w:p>
+      <w:pPr>
+        <w:pStyle w:val="NoSpacing"/>
+      </w:pPr>
+      <w:r>
+        <w:t xml:space="preserve">      price: "$</w:t>
+      </w:r>
+      <w:proofErr w:type="spellStart"/>
+      <w:r>
+        <w:t>product_details.price</w:t>
+      </w:r>
+      <w:proofErr w:type="spellEnd"/>
+      <w:r>
+        <w:t>"</w:t>
+      </w:r>
+    </w:p>
+    <w:p>
+      <w:pPr>
+        <w:pStyle w:val="NoSpacing"/>
+      </w:pPr>
+      <w:r>
+        <w:t xml:space="preserve">    }</w:t>
+      </w:r>
+    </w:p>
+    <w:p>
+      <w:pPr>
+        <w:pStyle w:val="NoSpacing"/>
+      </w:pPr>
+      <w:r>
+        <w:t xml:space="preserve">  }</w:t>
+      </w:r>
+    </w:p>
+    <w:p>
+      <w:pPr>
+        <w:pStyle w:val="NoSpacing"/>
+      </w:pPr>
+    </w:p>
+    <w:p>
+      <w:pPr>
+        <w:pStyle w:val="NoSpacing"/>
+      </w:pPr>
+    </w:p>
+    <w:p>
+      <w:pPr>
+        <w:pStyle w:val="NoSpacing"/>
+      </w:pPr>
+      <w:r>
+        <w:t>]</w:t>
+      </w:r>
+    </w:p>
+    <w:p>
+      <w:pPr>
+        <w:pStyle w:val="NoSpacing"/>
+      </w:pPr>
+      <w:r>
+        <w:br/>
+      </w:r>
+      <w:r>
+        <w:rPr>
+          <w:b/>
+          <w:bCs/>
+        </w:rPr>
+        <w:t>09</w:t>
+      </w:r>
+      <w:r>
+        <w:t>. Find products with category = Electronics.</w:t>
+      </w:r>
+    </w:p>
+    <w:p>
+      <w:pPr>
+        <w:pStyle w:val="NoSpacing"/>
+      </w:pPr>
+      <w:r>
+        <w:t>Ans: [</w:t>
+      </w:r>
+    </w:p>
+    <w:p>
+      <w:pPr>
+        <w:pStyle w:val="NoSpacing"/>
+      </w:pPr>
+      <w:r>
+        <w:t xml:space="preserve">  {</w:t>
+      </w:r>
+    </w:p>
+    <w:p>
+      <w:pPr>
+        <w:pStyle w:val="NoSpacing"/>
+      </w:pPr>
+      <w:r>
+        <w:t xml:space="preserve">    $match: {</w:t>
+      </w:r>
+    </w:p>
+    <w:p>
+      <w:pPr>
+        <w:pStyle w:val="NoSpacing"/>
+      </w:pPr>
+      <w:r>
         <w:t xml:space="preserve">    </w:t>
       </w:r>
-      <w:proofErr w:type="gramStart"/>
-      <w:r>
-        <w:t>{ $</w:t>
-      </w:r>
-      <w:proofErr w:type="gramEnd"/>
-      <w:r>
-        <w:t>unwind: "$user_details</w:t>
-      </w:r>
-      <w:proofErr w:type="gramStart"/>
-      <w:r>
-        <w:t>" }</w:t>
-      </w:r>
-      <w:proofErr w:type="gramEnd"/>
-    </w:p>
-    <w:p>
-      <w:pPr>
-        <w:pStyle w:val="NoSpacing"/>
-      </w:pPr>
-      <w:r>
-        <w:t xml:space="preserve">  ,</w:t>
+      <w:r>
+        <w:tab/>
+        <w:t>category: {$</w:t>
+      </w:r>
+      <w:proofErr w:type="spellStart"/>
+      <w:r>
+        <w:t>eq</w:t>
+      </w:r>
+      <w:proofErr w:type="spellEnd"/>
+      <w:r>
+        <w:t>: "Electronics"}</w:t>
+      </w:r>
+    </w:p>
+    <w:p>
+      <w:pPr>
+        <w:pStyle w:val="NoSpacing"/>
+      </w:pPr>
+      <w:r>
+        <w:t xml:space="preserve">    }</w:t>
+      </w:r>
+    </w:p>
+    <w:p>
+      <w:pPr>
+        <w:pStyle w:val="NoSpacing"/>
+      </w:pPr>
+      <w:r>
+        <w:t xml:space="preserve">  }</w:t>
+      </w:r>
+    </w:p>
+    <w:p>
+      <w:pPr>
+        <w:pStyle w:val="NoSpacing"/>
+      </w:pPr>
+      <w:r>
+        <w:t>]</w:t>
+      </w:r>
+    </w:p>
+    <w:p>
+      <w:pPr>
+        <w:pStyle w:val="NoSpacing"/>
+      </w:pPr>
+      <w:r>
+        <w:br/>
+      </w:r>
+      <w:r>
+        <w:rPr>
+          <w:b/>
+          <w:bCs/>
+        </w:rPr>
+        <w:t>10</w:t>
+      </w:r>
+      <w:r>
+        <w:t>. Find users with role = admin.</w:t>
+      </w:r>
+    </w:p>
+    <w:p>
+      <w:pPr>
+        <w:pStyle w:val="NoSpacing"/>
+      </w:pPr>
+      <w:r>
+        <w:t>Ans: [</w:t>
       </w:r>
     </w:p>
     <w:p>
@@ -915,218 +1289,6 @@
         <w:pStyle w:val="NoSpacing"/>
       </w:pPr>
       <w:r>
-        <w:t xml:space="preserve">    $lookup: {</w:t>
-      </w:r>
-    </w:p>
-    <w:p>
-      <w:pPr>
-        <w:pStyle w:val="NoSpacing"/>
-      </w:pPr>
-      <w:r>
-        <w:t xml:space="preserve">      from: "products",</w:t>
-      </w:r>
-    </w:p>
-    <w:p>
-      <w:pPr>
-        <w:pStyle w:val="NoSpacing"/>
-      </w:pPr>
-      <w:r>
-        <w:t xml:space="preserve">      localField: "productId",</w:t>
-      </w:r>
-    </w:p>
-    <w:p>
-      <w:pPr>
-        <w:pStyle w:val="NoSpacing"/>
-      </w:pPr>
-      <w:r>
-        <w:t xml:space="preserve">      foreignField: "_id",</w:t>
-      </w:r>
-    </w:p>
-    <w:p>
-      <w:pPr>
-        <w:pStyle w:val="NoSpacing"/>
-      </w:pPr>
-      <w:r>
-        <w:t xml:space="preserve">      as: "product_details"</w:t>
-      </w:r>
-    </w:p>
-    <w:p>
-      <w:pPr>
-        <w:pStyle w:val="NoSpacing"/>
-      </w:pPr>
-      <w:r>
-        <w:t xml:space="preserve">    },</w:t>
-      </w:r>
-    </w:p>
-    <w:p>
-      <w:pPr>
-        <w:pStyle w:val="NoSpacing"/>
-      </w:pPr>
-      <w:r>
-        <w:t xml:space="preserve">  },</w:t>
-      </w:r>
-    </w:p>
-    <w:p>
-      <w:pPr>
-        <w:pStyle w:val="NoSpacing"/>
-      </w:pPr>
-      <w:r>
-        <w:t xml:space="preserve">  </w:t>
-      </w:r>
-      <w:proofErr w:type="gramStart"/>
-      <w:r>
-        <w:t>{ $</w:t>
-      </w:r>
-      <w:proofErr w:type="gramEnd"/>
-      <w:r>
-        <w:t>unwind: "$product_details</w:t>
-      </w:r>
-      <w:proofErr w:type="gramStart"/>
-      <w:r>
-        <w:t>" }</w:t>
-      </w:r>
-      <w:proofErr w:type="gramEnd"/>
-      <w:r>
-        <w:t>,</w:t>
-      </w:r>
-    </w:p>
-    <w:p>
-      <w:pPr>
-        <w:pStyle w:val="NoSpacing"/>
-      </w:pPr>
-      <w:r>
-        <w:t xml:space="preserve">  {</w:t>
-      </w:r>
-    </w:p>
-    <w:p>
-      <w:pPr>
-        <w:pStyle w:val="NoSpacing"/>
-      </w:pPr>
-      <w:r>
-        <w:t xml:space="preserve">     $project: {</w:t>
-      </w:r>
-    </w:p>
-    <w:p>
-      <w:pPr>
-        <w:pStyle w:val="NoSpacing"/>
-      </w:pPr>
-      <w:r>
-        <w:t xml:space="preserve">      quantity: 1,</w:t>
-      </w:r>
-    </w:p>
-    <w:p>
-      <w:pPr>
-        <w:pStyle w:val="NoSpacing"/>
-      </w:pPr>
-      <w:r>
-        <w:t xml:space="preserve">      total: 1,</w:t>
-      </w:r>
-    </w:p>
-    <w:p>
-      <w:pPr>
-        <w:pStyle w:val="NoSpacing"/>
-      </w:pPr>
-      <w:r>
-        <w:t xml:space="preserve">      user: "$user_details.name",</w:t>
-      </w:r>
-    </w:p>
-    <w:p>
-      <w:pPr>
-        <w:pStyle w:val="NoSpacing"/>
-      </w:pPr>
-      <w:r>
-        <w:t xml:space="preserve">      paroduct: "$product_details.name",</w:t>
-      </w:r>
-    </w:p>
-    <w:p>
-      <w:pPr>
-        <w:pStyle w:val="NoSpacing"/>
-      </w:pPr>
-      <w:r>
-        <w:t xml:space="preserve">      price: "$product_</w:t>
-      </w:r>
-      <w:proofErr w:type="gramStart"/>
-      <w:r>
-        <w:t>details.price</w:t>
-      </w:r>
-      <w:proofErr w:type="gramEnd"/>
-      <w:r>
-        <w:t>"</w:t>
-      </w:r>
-    </w:p>
-    <w:p>
-      <w:pPr>
-        <w:pStyle w:val="NoSpacing"/>
-      </w:pPr>
-      <w:r>
-        <w:t xml:space="preserve">    }</w:t>
-      </w:r>
-    </w:p>
-    <w:p>
-      <w:pPr>
-        <w:pStyle w:val="NoSpacing"/>
-      </w:pPr>
-      <w:r>
-        <w:t xml:space="preserve">  }</w:t>
-      </w:r>
-    </w:p>
-    <w:p>
-      <w:pPr>
-        <w:pStyle w:val="NoSpacing"/>
-      </w:pPr>
-    </w:p>
-    <w:p>
-      <w:pPr>
-        <w:pStyle w:val="NoSpacing"/>
-      </w:pPr>
-    </w:p>
-    <w:p>
-      <w:pPr>
-        <w:pStyle w:val="NoSpacing"/>
-      </w:pPr>
-      <w:r>
-        <w:t>]</w:t>
-      </w:r>
-    </w:p>
-    <w:p>
-      <w:pPr>
-        <w:pStyle w:val="NoSpacing"/>
-      </w:pPr>
-      <w:r>
-        <w:br/>
-      </w:r>
-      <w:r>
-        <w:rPr>
-          <w:b/>
-          <w:bCs/>
-        </w:rPr>
-        <w:t>09</w:t>
-      </w:r>
-      <w:r>
-        <w:t>. Find products with category = Electronics.</w:t>
-      </w:r>
-    </w:p>
-    <w:p>
-      <w:pPr>
-        <w:pStyle w:val="NoSpacing"/>
-      </w:pPr>
-      <w:r>
-        <w:t>Ans: [</w:t>
-      </w:r>
-    </w:p>
-    <w:p>
-      <w:pPr>
-        <w:pStyle w:val="NoSpacing"/>
-      </w:pPr>
-      <w:r>
-        <w:t xml:space="preserve">  {</w:t>
-      </w:r>
-    </w:p>
-    <w:p>
-      <w:pPr>
-        <w:pStyle w:val="NoSpacing"/>
-      </w:pPr>
-      <w:r>
         <w:t xml:space="preserve">    $match: {</w:t>
       </w:r>
     </w:p>
@@ -1135,84 +1297,6 @@
         <w:pStyle w:val="NoSpacing"/>
       </w:pPr>
       <w:r>
-        <w:t xml:space="preserve">    </w:t>
-      </w:r>
-      <w:r>
-        <w:tab/>
-        <w:t>category: {$eq: "Electronics"}</w:t>
-      </w:r>
-    </w:p>
-    <w:p>
-      <w:pPr>
-        <w:pStyle w:val="NoSpacing"/>
-      </w:pPr>
-      <w:r>
-        <w:t xml:space="preserve">    }</w:t>
-      </w:r>
-    </w:p>
-    <w:p>
-      <w:pPr>
-        <w:pStyle w:val="NoSpacing"/>
-      </w:pPr>
-      <w:r>
-        <w:t xml:space="preserve">  }</w:t>
-      </w:r>
-    </w:p>
-    <w:p>
-      <w:pPr>
-        <w:pStyle w:val="NoSpacing"/>
-      </w:pPr>
-      <w:r>
-        <w:t>]</w:t>
-      </w:r>
-    </w:p>
-    <w:p>
-      <w:pPr>
-        <w:pStyle w:val="NoSpacing"/>
-      </w:pPr>
-      <w:r>
-        <w:br/>
-      </w:r>
-      <w:r>
-        <w:rPr>
-          <w:b/>
-          <w:bCs/>
-        </w:rPr>
-        <w:t>10</w:t>
-      </w:r>
-      <w:r>
-        <w:t>. Find users with role = admin.</w:t>
-      </w:r>
-    </w:p>
-    <w:p>
-      <w:pPr>
-        <w:pStyle w:val="NoSpacing"/>
-      </w:pPr>
-      <w:r>
-        <w:t>Ans: [</w:t>
-      </w:r>
-    </w:p>
-    <w:p>
-      <w:pPr>
-        <w:pStyle w:val="NoSpacing"/>
-      </w:pPr>
-      <w:r>
-        <w:t xml:space="preserve">  {</w:t>
-      </w:r>
-    </w:p>
-    <w:p>
-      <w:pPr>
-        <w:pStyle w:val="NoSpacing"/>
-      </w:pPr>
-      <w:r>
-        <w:t xml:space="preserve">    $match: {</w:t>
-      </w:r>
-    </w:p>
-    <w:p>
-      <w:pPr>
-        <w:pStyle w:val="NoSpacing"/>
-      </w:pPr>
-      <w:r>
         <w:t xml:space="preserve">      role: {</w:t>
       </w:r>
     </w:p>
@@ -1221,7 +1305,15 @@
         <w:pStyle w:val="NoSpacing"/>
       </w:pPr>
       <w:r>
-        <w:t xml:space="preserve">        $eq: "admin"</w:t>
+        <w:t xml:space="preserve">        $</w:t>
+      </w:r>
+      <w:proofErr w:type="spellStart"/>
+      <w:r>
+        <w:t>eq</w:t>
+      </w:r>
+      <w:proofErr w:type="spellEnd"/>
+      <w:r>
+        <w:t>: "admin"</w:t>
       </w:r>
     </w:p>
     <w:p>
@@ -1297,31 +1389,7 @@
         <w:pStyle w:val="NoSpacing"/>
       </w:pPr>
       <w:r>
-        <w:t xml:space="preserve">  </w:t>
-      </w:r>
-      <w:proofErr w:type="gramStart"/>
-      <w:r>
-        <w:t>{ $</w:t>
-      </w:r>
-      <w:proofErr w:type="gramEnd"/>
-      <w:r>
-        <w:t xml:space="preserve">project: </w:t>
-      </w:r>
-      <w:proofErr w:type="gramStart"/>
-      <w:r>
-        <w:t>{ name</w:t>
-      </w:r>
-      <w:proofErr w:type="gramEnd"/>
-      <w:r>
-        <w:t xml:space="preserve">: 1, city: 1, _id: </w:t>
-      </w:r>
-      <w:proofErr w:type="gramStart"/>
-      <w:r>
-        <w:t>0 }</w:t>
-      </w:r>
-      <w:proofErr w:type="gramEnd"/>
-      <w:r>
-        <w:t xml:space="preserve"> }</w:t>
+        <w:t xml:space="preserve">  { $project: { name: 1, city: 1, _id: 0 } }</w:t>
       </w:r>
     </w:p>
     <w:p>
@@ -1363,31 +1431,7 @@
         <w:pStyle w:val="NoSpacing"/>
       </w:pPr>
       <w:r>
-        <w:t xml:space="preserve">  </w:t>
-      </w:r>
-      <w:proofErr w:type="gramStart"/>
-      <w:r>
-        <w:t>{ $</w:t>
-      </w:r>
-      <w:proofErr w:type="gramEnd"/>
-      <w:r>
-        <w:t xml:space="preserve">project: </w:t>
-      </w:r>
-      <w:proofErr w:type="gramStart"/>
-      <w:r>
-        <w:t>{ name</w:t>
-      </w:r>
-      <w:proofErr w:type="gramEnd"/>
-      <w:r>
-        <w:t xml:space="preserve">: 1, price: 1, _id: </w:t>
-      </w:r>
-      <w:proofErr w:type="gramStart"/>
-      <w:r>
-        <w:t>0 }</w:t>
-      </w:r>
-      <w:proofErr w:type="gramEnd"/>
-      <w:r>
-        <w:t xml:space="preserve"> }</w:t>
+        <w:t xml:space="preserve">  { $project: { name: 1, price: 1, _id: 0 } }</w:t>
       </w:r>
     </w:p>
     <w:p>
@@ -1440,7 +1484,15 @@
         <w:pStyle w:val="NoSpacing"/>
       </w:pPr>
       <w:r>
-        <w:t xml:space="preserve">      total: {$gt: 5000}</w:t>
+        <w:t xml:space="preserve">      total: {$</w:t>
+      </w:r>
+      <w:proofErr w:type="spellStart"/>
+      <w:r>
+        <w:t>gt</w:t>
+      </w:r>
+      <w:proofErr w:type="spellEnd"/>
+      <w:r>
+        <w:t>: 5000}</w:t>
       </w:r>
     </w:p>
     <w:p>
@@ -1509,13 +1561,24 @@
         <w:pStyle w:val="NoSpacing"/>
       </w:pPr>
       <w:r>
-        <w:t xml:space="preserve">      total: {$gt: 1000, $lt: </w:t>
-      </w:r>
-      <w:proofErr w:type="gramStart"/>
-      <w:r>
-        <w:t>10000 }</w:t>
-      </w:r>
-      <w:proofErr w:type="gramEnd"/>
+        <w:t xml:space="preserve">      total: {$</w:t>
+      </w:r>
+      <w:proofErr w:type="spellStart"/>
+      <w:r>
+        <w:t>gt</w:t>
+      </w:r>
+      <w:proofErr w:type="spellEnd"/>
+      <w:r>
+        <w:t>: 1000, $</w:t>
+      </w:r>
+      <w:proofErr w:type="spellStart"/>
+      <w:r>
+        <w:t>lt</w:t>
+      </w:r>
+      <w:proofErr w:type="spellEnd"/>
+      <w:r>
+        <w:t>: 10000 }</w:t>
+      </w:r>
     </w:p>
     <w:p>
       <w:pPr>
@@ -1583,21 +1646,8 @@
         <w:pStyle w:val="NoSpacing"/>
       </w:pPr>
       <w:r>
-        <w:t xml:space="preserve">      city: </w:t>
-      </w:r>
-      <w:proofErr w:type="gramStart"/>
-      <w:r>
-        <w:t>{ $</w:t>
-      </w:r>
-      <w:proofErr w:type="gramEnd"/>
-      <w:r>
-        <w:t>in: ["Surat", "Ahmedabad"</w:t>
-      </w:r>
-      <w:proofErr w:type="gramStart"/>
-      <w:r>
-        <w:t>] }</w:t>
-      </w:r>
-      <w:proofErr w:type="gramEnd"/>
+        <w:t xml:space="preserve">      city: { $in: ["Surat", "Ahmedabad"] }</w:t>
+      </w:r>
     </w:p>
     <w:p>
       <w:pPr>
@@ -1671,15 +1721,7 @@
         <w:pStyle w:val="NoSpacing"/>
       </w:pPr>
       <w:r>
-        <w:t xml:space="preserve">      category: </w:t>
-      </w:r>
-      <w:proofErr w:type="gramStart"/>
-      <w:r>
-        <w:t>{ $</w:t>
-      </w:r>
-      <w:proofErr w:type="gramEnd"/>
-      <w:r>
-        <w:t>ne: "Electronics"}</w:t>
+        <w:t xml:space="preserve">      category: { $ne: "Electronics"}</w:t>
       </w:r>
     </w:p>
     <w:p>
@@ -1737,45 +1779,24 @@
         <w:pStyle w:val="NoSpacing"/>
       </w:pPr>
       <w:r>
-        <w:t xml:space="preserve">  </w:t>
-      </w:r>
-      <w:proofErr w:type="gramStart"/>
-      <w:r>
-        <w:t>{ $</w:t>
-      </w:r>
-      <w:proofErr w:type="gramEnd"/>
-      <w:r>
-        <w:t xml:space="preserve">match: </w:t>
-      </w:r>
-      <w:proofErr w:type="gramStart"/>
-      <w:r>
-        <w:t>{ age</w:t>
-      </w:r>
-      <w:proofErr w:type="gramEnd"/>
-      <w:r>
-        <w:t xml:space="preserve">: </w:t>
-      </w:r>
-      <w:proofErr w:type="gramStart"/>
-      <w:r>
-        <w:t>{ $</w:t>
-      </w:r>
-      <w:proofErr w:type="gramEnd"/>
-      <w:r>
-        <w:t xml:space="preserve">gte: 20, $lte: </w:t>
-      </w:r>
-      <w:proofErr w:type="gramStart"/>
-      <w:r>
-        <w:t>30 }</w:t>
-      </w:r>
-      <w:proofErr w:type="gramEnd"/>
-      <w:r>
-        <w:t xml:space="preserve"> </w:t>
-      </w:r>
-      <w:proofErr w:type="gramStart"/>
-      <w:r>
-        <w:t>} }</w:t>
-      </w:r>
-      <w:proofErr w:type="gramEnd"/>
+        <w:t xml:space="preserve">  { $match: { age: { $</w:t>
+      </w:r>
+      <w:proofErr w:type="spellStart"/>
+      <w:r>
+        <w:t>gte</w:t>
+      </w:r>
+      <w:proofErr w:type="spellEnd"/>
+      <w:r>
+        <w:t>: 20, $</w:t>
+      </w:r>
+      <w:proofErr w:type="spellStart"/>
+      <w:r>
+        <w:t>lte</w:t>
+      </w:r>
+      <w:proofErr w:type="spellEnd"/>
+      <w:r>
+        <w:t>: 30 } } }</w:t>
+      </w:r>
     </w:p>
     <w:p>
       <w:pPr>
@@ -1871,7 +1892,23 @@
           <w:b/>
           <w:bCs/>
         </w:rPr>
-        <w:t>status:{$eq: “Pending”}</w:t>
+        <w:t>status:{$</w:t>
+      </w:r>
+      <w:proofErr w:type="spellStart"/>
+      <w:r>
+        <w:rPr>
+          <w:b/>
+          <w:bCs/>
+        </w:rPr>
+        <w:t>eq</w:t>
+      </w:r>
+      <w:proofErr w:type="spellEnd"/>
+      <w:r>
+        <w:rPr>
+          <w:b/>
+          <w:bCs/>
+        </w:rPr>
+        <w:t>: “Pending”}</w:t>
       </w:r>
       <w:r>
         <w:t xml:space="preserve"> this is also same as above query</w:t>
@@ -1911,7 +1948,15 @@
         <w:pStyle w:val="NoSpacing"/>
       </w:pPr>
       <w:r>
-        <w:t xml:space="preserve">  { $match: { stock: { $lt: 10 } } }</w:t>
+        <w:t xml:space="preserve">  { $match: { stock: { $</w:t>
+      </w:r>
+      <w:proofErr w:type="spellStart"/>
+      <w:r>
+        <w:t>lt</w:t>
+      </w:r>
+      <w:proofErr w:type="spellEnd"/>
+      <w:r>
+        <w:t>: 10 } } }</w:t>
       </w:r>
     </w:p>
     <w:p>
@@ -1937,26 +1982,39 @@
         <w:t>20</w:t>
       </w:r>
       <w:r>
-        <w:t>. Rename price field as productPrice in output.</w:t>
-      </w:r>
-    </w:p>
-    <w:p>
-      <w:pPr>
-        <w:pStyle w:val="NoSpacing"/>
-      </w:pPr>
-      <w:r>
-        <w:t xml:space="preserve">Ans: </w:t>
-      </w:r>
-      <w:r>
-        <w:t>[</w:t>
-      </w:r>
-    </w:p>
-    <w:p>
-      <w:pPr>
-        <w:pStyle w:val="NoSpacing"/>
-      </w:pPr>
-      <w:r>
-        <w:t xml:space="preserve">  { $project: { name: 1, productPrice: "$price", _id: 0 } }</w:t>
+        <w:t xml:space="preserve">. Rename price field as </w:t>
+      </w:r>
+      <w:proofErr w:type="spellStart"/>
+      <w:r>
+        <w:t>productPrice</w:t>
+      </w:r>
+      <w:proofErr w:type="spellEnd"/>
+      <w:r>
+        <w:t xml:space="preserve"> in output.</w:t>
+      </w:r>
+    </w:p>
+    <w:p>
+      <w:pPr>
+        <w:pStyle w:val="NoSpacing"/>
+      </w:pPr>
+      <w:r>
+        <w:t>Ans: [</w:t>
+      </w:r>
+    </w:p>
+    <w:p>
+      <w:pPr>
+        <w:pStyle w:val="NoSpacing"/>
+      </w:pPr>
+      <w:r>
+        <w:t xml:space="preserve">  { $project: { name: 1, </w:t>
+      </w:r>
+      <w:proofErr w:type="spellStart"/>
+      <w:r>
+        <w:t>productPrice</w:t>
+      </w:r>
+      <w:proofErr w:type="spellEnd"/>
+      <w:r>
+        <w:t>: "$price", _id: 0 } }</w:t>
       </w:r>
     </w:p>
     <w:p>
@@ -1994,6 +2052,46 @@
       <w:r>
         <w:t>. Count total users.</w:t>
       </w:r>
+    </w:p>
+    <w:p>
+      <w:pPr>
+        <w:pStyle w:val="NoSpacing"/>
+      </w:pPr>
+      <w:r>
+        <w:t xml:space="preserve">Ans. </w:t>
+      </w:r>
+      <w:r>
+        <w:t>[</w:t>
+      </w:r>
+    </w:p>
+    <w:p>
+      <w:pPr>
+        <w:pStyle w:val="NoSpacing"/>
+      </w:pPr>
+      <w:r>
+        <w:t xml:space="preserve">  { $count: "</w:t>
+      </w:r>
+      <w:proofErr w:type="spellStart"/>
+      <w:r>
+        <w:t>totalUsers</w:t>
+      </w:r>
+      <w:proofErr w:type="spellEnd"/>
+      <w:r>
+        <w:t>" }</w:t>
+      </w:r>
+    </w:p>
+    <w:p>
+      <w:pPr>
+        <w:pStyle w:val="NoSpacing"/>
+      </w:pPr>
+      <w:r>
+        <w:t>]</w:t>
+      </w:r>
+    </w:p>
+    <w:p>
+      <w:pPr>
+        <w:pStyle w:val="NoSpacing"/>
+      </w:pPr>
       <w:r>
         <w:br/>
       </w:r>
@@ -2007,6 +2105,38 @@
       <w:r>
         <w:t>. Count total products in each category.</w:t>
       </w:r>
+    </w:p>
+    <w:p>
+      <w:pPr>
+        <w:pStyle w:val="NoSpacing"/>
+      </w:pPr>
+      <w:r>
+        <w:t xml:space="preserve">Ans: </w:t>
+      </w:r>
+      <w:r>
+        <w:t>[</w:t>
+      </w:r>
+    </w:p>
+    <w:p>
+      <w:pPr>
+        <w:pStyle w:val="NoSpacing"/>
+      </w:pPr>
+      <w:r>
+        <w:t xml:space="preserve">  { $group: { _id: "$category", count: { $sum: 1 } } }</w:t>
+      </w:r>
+    </w:p>
+    <w:p>
+      <w:pPr>
+        <w:pStyle w:val="NoSpacing"/>
+      </w:pPr>
+      <w:r>
+        <w:t>]</w:t>
+      </w:r>
+    </w:p>
+    <w:p>
+      <w:pPr>
+        <w:pStyle w:val="NoSpacing"/>
+      </w:pPr>
       <w:r>
         <w:br/>
       </w:r>
@@ -2020,6 +2150,38 @@
       <w:r>
         <w:t>. Count total users in each city.</w:t>
       </w:r>
+    </w:p>
+    <w:p>
+      <w:pPr>
+        <w:pStyle w:val="NoSpacing"/>
+      </w:pPr>
+      <w:r>
+        <w:t xml:space="preserve">Ans. </w:t>
+      </w:r>
+      <w:r>
+        <w:t>[</w:t>
+      </w:r>
+    </w:p>
+    <w:p>
+      <w:pPr>
+        <w:pStyle w:val="NoSpacing"/>
+      </w:pPr>
+      <w:r>
+        <w:t xml:space="preserve">  { $group: { _id: "$city", count: { $sum: 1 } } }</w:t>
+      </w:r>
+    </w:p>
+    <w:p>
+      <w:pPr>
+        <w:pStyle w:val="NoSpacing"/>
+      </w:pPr>
+      <w:r>
+        <w:t>]</w:t>
+      </w:r>
+    </w:p>
+    <w:p>
+      <w:pPr>
+        <w:pStyle w:val="NoSpacing"/>
+      </w:pPr>
       <w:r>
         <w:br/>
       </w:r>
@@ -2033,7 +2195,56 @@
       <w:r>
         <w:t>. Find average age of users.</w:t>
       </w:r>
-      <w:r>
+    </w:p>
+    <w:p>
+      <w:pPr>
+        <w:pStyle w:val="NoSpacing"/>
+      </w:pPr>
+      <w:r>
+        <w:t xml:space="preserve">Ans. </w:t>
+      </w:r>
+      <w:r>
+        <w:t>[</w:t>
+      </w:r>
+    </w:p>
+    <w:p>
+      <w:pPr>
+        <w:pStyle w:val="NoSpacing"/>
+      </w:pPr>
+      <w:r>
+        <w:t xml:space="preserve">  { $group: { _id: null, </w:t>
+      </w:r>
+      <w:proofErr w:type="spellStart"/>
+      <w:r>
+        <w:t>avgAge</w:t>
+      </w:r>
+      <w:proofErr w:type="spellEnd"/>
+      <w:r>
+        <w:t>: { $</w:t>
+      </w:r>
+      <w:proofErr w:type="spellStart"/>
+      <w:r>
+        <w:t>avg</w:t>
+      </w:r>
+      <w:proofErr w:type="spellEnd"/>
+      <w:r>
+        <w:t>: "$age" } } }</w:t>
+      </w:r>
+    </w:p>
+    <w:p>
+      <w:pPr>
+        <w:pStyle w:val="NoSpacing"/>
+      </w:pPr>
+      <w:r>
+        <w:t>]</w:t>
+      </w:r>
+    </w:p>
+    <w:p>
+      <w:pPr>
+        <w:pStyle w:val="NoSpacing"/>
+      </w:pPr>
+      <w:r>
+        <w:lastRenderedPageBreak/>
         <w:br/>
       </w:r>
       <w:r>
@@ -2046,6 +2257,46 @@
       <w:r>
         <w:t>. Find maximum product price.</w:t>
       </w:r>
+    </w:p>
+    <w:p>
+      <w:pPr>
+        <w:pStyle w:val="NoSpacing"/>
+      </w:pPr>
+      <w:r>
+        <w:t xml:space="preserve">Ans. </w:t>
+      </w:r>
+      <w:r>
+        <w:t>[</w:t>
+      </w:r>
+    </w:p>
+    <w:p>
+      <w:pPr>
+        <w:pStyle w:val="NoSpacing"/>
+      </w:pPr>
+      <w:r>
+        <w:t xml:space="preserve">  { $group: { _id: null, </w:t>
+      </w:r>
+      <w:proofErr w:type="spellStart"/>
+      <w:r>
+        <w:t>maxPrice</w:t>
+      </w:r>
+      <w:proofErr w:type="spellEnd"/>
+      <w:r>
+        <w:t>: { $max: "$price" } } }</w:t>
+      </w:r>
+    </w:p>
+    <w:p>
+      <w:pPr>
+        <w:pStyle w:val="NoSpacing"/>
+      </w:pPr>
+      <w:r>
+        <w:t>]</w:t>
+      </w:r>
+    </w:p>
+    <w:p>
+      <w:pPr>
+        <w:pStyle w:val="NoSpacing"/>
+      </w:pPr>
       <w:r>
         <w:br/>
       </w:r>
@@ -2059,6 +2310,46 @@
       <w:r>
         <w:t>. Find minimum product price.</w:t>
       </w:r>
+    </w:p>
+    <w:p>
+      <w:pPr>
+        <w:pStyle w:val="NoSpacing"/>
+      </w:pPr>
+      <w:r>
+        <w:t xml:space="preserve">Ans. </w:t>
+      </w:r>
+      <w:r>
+        <w:t>[</w:t>
+      </w:r>
+    </w:p>
+    <w:p>
+      <w:pPr>
+        <w:pStyle w:val="NoSpacing"/>
+      </w:pPr>
+      <w:r>
+        <w:t xml:space="preserve">  { $group: { _id: null, </w:t>
+      </w:r>
+      <w:proofErr w:type="spellStart"/>
+      <w:r>
+        <w:t>minPrice</w:t>
+      </w:r>
+      <w:proofErr w:type="spellEnd"/>
+      <w:r>
+        <w:t>: { $min: "$price" } } }</w:t>
+      </w:r>
+    </w:p>
+    <w:p>
+      <w:pPr>
+        <w:pStyle w:val="NoSpacing"/>
+      </w:pPr>
+      <w:r>
+        <w:t>]</w:t>
+      </w:r>
+    </w:p>
+    <w:p>
+      <w:pPr>
+        <w:pStyle w:val="NoSpacing"/>
+      </w:pPr>
       <w:r>
         <w:br/>
       </w:r>
@@ -2072,6 +2363,46 @@
       <w:r>
         <w:t>. Find total revenue from orders.</w:t>
       </w:r>
+    </w:p>
+    <w:p>
+      <w:pPr>
+        <w:pStyle w:val="NoSpacing"/>
+      </w:pPr>
+      <w:r>
+        <w:t xml:space="preserve">Ans. </w:t>
+      </w:r>
+      <w:r>
+        <w:t>[</w:t>
+      </w:r>
+    </w:p>
+    <w:p>
+      <w:pPr>
+        <w:pStyle w:val="NoSpacing"/>
+      </w:pPr>
+      <w:r>
+        <w:t xml:space="preserve">  { $group: { _id: null, </w:t>
+      </w:r>
+      <w:proofErr w:type="spellStart"/>
+      <w:r>
+        <w:t>totalRevenue</w:t>
+      </w:r>
+      <w:proofErr w:type="spellEnd"/>
+      <w:r>
+        <w:t>: { $sum: "$total" } } }</w:t>
+      </w:r>
+    </w:p>
+    <w:p>
+      <w:pPr>
+        <w:pStyle w:val="NoSpacing"/>
+      </w:pPr>
+      <w:r>
+        <w:t>]</w:t>
+      </w:r>
+    </w:p>
+    <w:p>
+      <w:pPr>
+        <w:pStyle w:val="NoSpacing"/>
+      </w:pPr>
       <w:r>
         <w:br/>
       </w:r>
@@ -2085,6 +2416,54 @@
       <w:r>
         <w:t>. Find total orders per user.</w:t>
       </w:r>
+    </w:p>
+    <w:p>
+      <w:pPr>
+        <w:pStyle w:val="NoSpacing"/>
+      </w:pPr>
+      <w:r>
+        <w:t xml:space="preserve">Ans. </w:t>
+      </w:r>
+      <w:r>
+        <w:t>[</w:t>
+      </w:r>
+    </w:p>
+    <w:p>
+      <w:pPr>
+        <w:pStyle w:val="NoSpacing"/>
+      </w:pPr>
+      <w:r>
+        <w:t xml:space="preserve">  { $group: { _id: "$</w:t>
+      </w:r>
+      <w:proofErr w:type="spellStart"/>
+      <w:r>
+        <w:t>userId</w:t>
+      </w:r>
+      <w:proofErr w:type="spellEnd"/>
+      <w:r>
+        <w:t xml:space="preserve">", </w:t>
+      </w:r>
+      <w:proofErr w:type="spellStart"/>
+      <w:r>
+        <w:t>totalOrders</w:t>
+      </w:r>
+      <w:proofErr w:type="spellEnd"/>
+      <w:r>
+        <w:t>: { $sum: 1 } } }</w:t>
+      </w:r>
+    </w:p>
+    <w:p>
+      <w:pPr>
+        <w:pStyle w:val="NoSpacing"/>
+      </w:pPr>
+      <w:r>
+        <w:t>]</w:t>
+      </w:r>
+    </w:p>
+    <w:p>
+      <w:pPr>
+        <w:pStyle w:val="NoSpacing"/>
+      </w:pPr>
       <w:r>
         <w:br/>
       </w:r>
@@ -2098,6 +2477,94 @@
       <w:r>
         <w:t>. Find average product price per category.</w:t>
       </w:r>
+    </w:p>
+    <w:p>
+      <w:pPr>
+        <w:pStyle w:val="NoSpacing"/>
+      </w:pPr>
+      <w:r>
+        <w:t xml:space="preserve">Ans. </w:t>
+      </w:r>
+      <w:r>
+        <w:t>[</w:t>
+      </w:r>
+    </w:p>
+    <w:p>
+      <w:pPr>
+        <w:pStyle w:val="NoSpacing"/>
+      </w:pPr>
+      <w:r>
+        <w:t xml:space="preserve">  {</w:t>
+      </w:r>
+    </w:p>
+    <w:p>
+      <w:pPr>
+        <w:pStyle w:val="NoSpacing"/>
+      </w:pPr>
+      <w:r>
+        <w:t xml:space="preserve">    $group: {</w:t>
+      </w:r>
+    </w:p>
+    <w:p>
+      <w:pPr>
+        <w:pStyle w:val="NoSpacing"/>
+      </w:pPr>
+      <w:r>
+        <w:t xml:space="preserve">      _id: "$category",</w:t>
+      </w:r>
+    </w:p>
+    <w:p>
+      <w:pPr>
+        <w:pStyle w:val="NoSpacing"/>
+      </w:pPr>
+      <w:r>
+        <w:t xml:space="preserve">      </w:t>
+      </w:r>
+      <w:proofErr w:type="spellStart"/>
+      <w:r>
+        <w:t>avgPrice</w:t>
+      </w:r>
+      <w:proofErr w:type="spellEnd"/>
+      <w:r>
+        <w:t>: { $</w:t>
+      </w:r>
+      <w:proofErr w:type="spellStart"/>
+      <w:r>
+        <w:t>avg</w:t>
+      </w:r>
+      <w:proofErr w:type="spellEnd"/>
+      <w:r>
+        <w:t>: "$price" }</w:t>
+      </w:r>
+    </w:p>
+    <w:p>
+      <w:pPr>
+        <w:pStyle w:val="NoSpacing"/>
+      </w:pPr>
+      <w:r>
+        <w:t xml:space="preserve">    }</w:t>
+      </w:r>
+    </w:p>
+    <w:p>
+      <w:pPr>
+        <w:pStyle w:val="NoSpacing"/>
+      </w:pPr>
+      <w:r>
+        <w:t xml:space="preserve">  }</w:t>
+      </w:r>
+    </w:p>
+    <w:p>
+      <w:pPr>
+        <w:pStyle w:val="NoSpacing"/>
+      </w:pPr>
+      <w:r>
+        <w:t>]</w:t>
+      </w:r>
+    </w:p>
+    <w:p>
+      <w:pPr>
+        <w:pStyle w:val="NoSpacing"/>
+      </w:pPr>
       <w:r>
         <w:br/>
       </w:r>
@@ -2113,6 +2580,84 @@
       </w:r>
       <w:r>
         <w:br/>
+      </w:r>
+      <w:r>
+        <w:t xml:space="preserve">Ans.  </w:t>
+      </w:r>
+      <w:r>
+        <w:t>[</w:t>
+      </w:r>
+    </w:p>
+    <w:p>
+      <w:pPr>
+        <w:pStyle w:val="NoSpacing"/>
+      </w:pPr>
+      <w:r>
+        <w:t xml:space="preserve">  {</w:t>
+      </w:r>
+    </w:p>
+    <w:p>
+      <w:pPr>
+        <w:pStyle w:val="NoSpacing"/>
+      </w:pPr>
+      <w:r>
+        <w:t xml:space="preserve">    $group: {</w:t>
+      </w:r>
+    </w:p>
+    <w:p>
+      <w:pPr>
+        <w:pStyle w:val="NoSpacing"/>
+      </w:pPr>
+      <w:r>
+        <w:t xml:space="preserve">      _id: "$</w:t>
+      </w:r>
+      <w:proofErr w:type="spellStart"/>
+      <w:r>
+        <w:t>userId</w:t>
+      </w:r>
+      <w:proofErr w:type="spellEnd"/>
+      <w:r>
+        <w:t>",</w:t>
+      </w:r>
+    </w:p>
+    <w:p>
+      <w:pPr>
+        <w:pStyle w:val="NoSpacing"/>
+      </w:pPr>
+      <w:r>
+        <w:t xml:space="preserve">      </w:t>
+      </w:r>
+      <w:proofErr w:type="spellStart"/>
+      <w:r>
+        <w:t>maxOrder</w:t>
+      </w:r>
+      <w:proofErr w:type="spellEnd"/>
+      <w:r>
+        <w:t>: { $max: "$total" }</w:t>
+      </w:r>
+    </w:p>
+    <w:p>
+      <w:pPr>
+        <w:pStyle w:val="NoSpacing"/>
+      </w:pPr>
+      <w:r>
+        <w:t xml:space="preserve">    }</w:t>
+      </w:r>
+    </w:p>
+    <w:p>
+      <w:pPr>
+        <w:pStyle w:val="NoSpacing"/>
+      </w:pPr>
+      <w:r>
+        <w:t xml:space="preserve">  }</w:t>
+      </w:r>
+    </w:p>
+    <w:p>
+      <w:pPr>
+        <w:pStyle w:val="NoSpacing"/>
+      </w:pPr>
+      <w:r>
+        <w:t>]</w:t>
       </w:r>
       <w:r>
         <w:br/>
@@ -2225,7 +2770,6 @@
           <w:b/>
           <w:bCs/>
         </w:rPr>
-        <w:lastRenderedPageBreak/>
         <w:t>38</w:t>
       </w:r>
       <w:r>
@@ -2319,6 +2863,7 @@
           <w:b/>
           <w:bCs/>
         </w:rPr>
+        <w:lastRenderedPageBreak/>
         <w:t>44</w:t>
       </w:r>
       <w:r>

</xml_diff>